<commit_message>
Update Jul 18 checklist: registered-student email edit via server endpoint
Reflects the merged behavior from the client batch (66a794d): registered
students' emails are editable through /api/admin-update-student-email; the
unregistered flow keeps the invite-resend prompt.

Co-Authored-By: Claude Fable 5 <noreply@anthropic.com>
</commit_message>
<xml_diff>
--- a/Jul 18-test-checklist.docx
+++ b/Jul 18-test-checklist.docx
@@ -435,42 +435,42 @@
           <w:sz w:val="21"/>
           <w:szCs w:val="21"/>
         </w:rPr>
-        <w:t xml:space="preserve">El. pašto redagavimas iki registracijos</w:t>
-      </w:r>
-      <w:r>
-        <w:rPr>
-          <w:sz w:val="21"/>
-          <w:szCs w:val="21"/>
-        </w:rPr>
-        <w:t xml:space="preserve"> — „Redaguoti mokinio duomenis“ blokas dabar rodomas ir Pro Klasei (buvo tik mokykloms). El. paštą galima keisti tik kol mokinys NEprisiregistravęs; telefoną ir kitus laukus — visada. Kontaktiniai pakeitimai pritaikomi visoms mokinio poroms.</w:t>
-      </w:r>
-    </w:p>
-    <w:p>
-      <w:pPr>
-        <w:spacing w:after="60"/>
-        <w:ind w:left="360"/>
-      </w:pPr>
-      <w:r>
-        <w:rPr>
-          <w:b/>
-          <w:bCs/>
-          <w:i/>
-          <w:iCs/>
-          <w:color w:val="595959"/>
-          <w:sz w:val="20"/>
-          <w:szCs w:val="20"/>
-        </w:rPr>
-        <w:t xml:space="preserve">Kaip testuoti: </w:t>
-      </w:r>
-      <w:r>
-        <w:rPr>
-          <w:i/>
-          <w:iCs/>
-          <w:color w:val="595959"/>
-          <w:sz w:val="20"/>
-          <w:szCs w:val="20"/>
-        </w:rPr>
-        <w:t xml:space="preserve">Pakeisti neprisiregistravusio mokinio el. paštą → išsaugoti → pasiūlymas „Išsiųsti kvietimą nauju adresu?“ → patvirtinus laiškas išeina nauju adresu. Prisiregistravusio mokinio el. pašto laukas užrakintas su paaiškinimu.</w:t>
+        <w:t xml:space="preserve">Mokinio el. pašto redagavimas</w:t>
+      </w:r>
+      <w:r>
+        <w:rPr>
+          <w:sz w:val="21"/>
+          <w:szCs w:val="21"/>
+        </w:rPr>
+        <w:t xml:space="preserve"> — „Redaguoti mokinio duomenis“ blokas dabar rodomas ir Pro Klasei (buvo tik mokykloms). NEprisiregistravusio mokinio el. pašto pakeitimas pasiūlo iš naujo išsiųsti kvietimą; PRISIREGISTRAVUSIO — keičiamas per serverį (/api/admin-update-student-email: atnaujina ir prisijungimo paskyrą, tikrina dublikatus bei sutapimą su org korepetitoriaus el. paštu). Telefonas ir kiti laukai — visada; kontaktiniai pakeitimai pritaikomi visoms mokinio poroms.</w:t>
+      </w:r>
+    </w:p>
+    <w:p>
+      <w:pPr>
+        <w:spacing w:after="60"/>
+        <w:ind w:left="360"/>
+      </w:pPr>
+      <w:r>
+        <w:rPr>
+          <w:b/>
+          <w:bCs/>
+          <w:i/>
+          <w:iCs/>
+          <w:color w:val="595959"/>
+          <w:sz w:val="20"/>
+          <w:szCs w:val="20"/>
+        </w:rPr>
+        <w:t xml:space="preserve">Kaip testuoti: </w:t>
+      </w:r>
+      <w:r>
+        <w:rPr>
+          <w:i/>
+          <w:iCs/>
+          <w:color w:val="595959"/>
+          <w:sz w:val="20"/>
+          <w:szCs w:val="20"/>
+        </w:rPr>
+        <w:t xml:space="preserve">1) Neprisiregistravęs: pakeisti el. paštą → išsaugoti → pasiūlymas „Išsiųsti kvietimą nauju adresu?“ → laiškas išeina nauju adresu. 2) Prisiregistravęs: pakeisti el. paštą → išsaugoma, mokinys prisijungia jau NAUJU el. paštu; bandant įrašyti kito vartotojo/korepetitoriaus el. paštą — aiški klaida.</w:t>
       </w:r>
     </w:p>
     <w:p>

</xml_diff>